<commit_message>
v0.40.1 — Proposte in Word più ordinate
Nei modelli delle proposte: elenchi puntati con il rientro, telefono ed
e-mail a sinistra del destinatario allineati in basso, titolo staccato dal
logo e logo intero, rigenerato dall'SVG originale.

Co-Authored-By: Claude Opus 5.5 <noreply@anthropic.com>
</commit_message>
<xml_diff>
--- a/app/Templates/word/proposta_addolcitori.docx
+++ b/app/Templates/word/proposta_addolcitori.docx
@@ -20,303 +20,304 @@
         </w:rPr>
       </w:pPr>
     </w:p>
+    <w:tbl>
+      <w:tblPr>
+        <w:tblW w:w="9638" w:type="dxa"/>
+        <w:tblLayout w:type="fixed"/>
+        <w:tblCellMar>
+          <w:left w:w="0" w:type="dxa"/>
+          <w:right w:w="0" w:type="dxa"/>
+        </w:tblCellMar>
+        <w:tblLook w:val="0000" w:firstRow="0" w:lastRow="0" w:firstColumn="0" w:lastColumn="0" w:noHBand="0" w:noVBand="0"/>
+      </w:tblPr>
+      <w:tblGrid>
+        <w:gridCol w:w="5103"/>
+        <w:gridCol w:w="4535"/>
+      </w:tblGrid>
+      <w:tr>
+        <w:tc>
+          <w:tcPr>
+            <w:tcW w:w="5103" w:type="dxa"/>
+            <w:vAlign w:val="bottom"/>
+          </w:tcPr>
+          <w:p>
+            <w:pPr>
+              <w:spacing w:after="0" w:line="240" w:lineRule="auto"/>
+              <w:rPr>
+                <w:rFonts w:ascii="Verdana" w:eastAsia="Times New Roman" w:hAnsi="Verdana" w:cs="Times New Roman"/>
+                <w:kern w:val="0"/>
+                <w:sz w:val="20"/>
+                <w:szCs w:val="20"/>
+                <w:lang w:eastAsia="ja-JP"/>
+                <w14:ligatures w14:val="none"/>
+              </w:rPr>
+            </w:pPr>
+          </w:p>
+          <w:p>
+            <w:pPr>
+              <w:spacing w:after="0" w:line="240" w:lineRule="auto"/>
+              <w:rPr>
+                <w:rFonts w:ascii="Verdana" w:eastAsia="Times New Roman" w:hAnsi="Verdana" w:cs="Times New Roman"/>
+                <w:kern w:val="0"/>
+                <w:sz w:val="20"/>
+                <w:szCs w:val="20"/>
+                <w:lang w:eastAsia="ja-JP"/>
+                <w14:ligatures w14:val="none"/>
+              </w:rPr>
+            </w:pPr>
+            <w:r>
+              <w:rPr>
+                <w:rFonts w:ascii="Verdana" w:eastAsia="Times New Roman" w:hAnsi="Verdana" w:cs="Times New Roman"/>
+                <w:noProof/>
+                <w:kern w:val="0"/>
+                <w:sz w:val="20"/>
+                <w:szCs w:val="20"/>
+                <w:lang w:eastAsia="ja-JP"/>
+                <w14:ligatures w14:val="none"/>
+              </w:rPr>
+              <w:t xml:space="preserve">${riga_telefono}</w:t>
+            </w:r>
+          </w:p>
+          <w:p>
+            <w:pPr>
+              <w:spacing w:after="0" w:line="240" w:lineRule="auto"/>
+              <w:rPr>
+                <w:rFonts w:ascii="Verdana" w:eastAsia="Times New Roman" w:hAnsi="Verdana" w:cs="Times New Roman"/>
+                <w:kern w:val="0"/>
+                <w:sz w:val="20"/>
+                <w:szCs w:val="20"/>
+                <w:lang w:eastAsia="ja-JP"/>
+                <w14:ligatures w14:val="none"/>
+              </w:rPr>
+            </w:pPr>
+            <w:r>
+              <w:rPr>
+                <w:rFonts w:ascii="Verdana" w:eastAsia="Times New Roman" w:hAnsi="Verdana" w:cs="Times New Roman"/>
+                <w:noProof/>
+                <w:kern w:val="0"/>
+                <w:sz w:val="20"/>
+                <w:szCs w:val="20"/>
+                <w:lang w:eastAsia="ja-JP"/>
+                <w14:ligatures w14:val="none"/>
+              </w:rPr>
+              <w:t xml:space="preserve">Tel ${telefono}</w:t>
+            </w:r>
+          </w:p>
+          <w:p>
+            <w:pPr>
+              <w:spacing w:after="0" w:line="240" w:lineRule="auto"/>
+              <w:rPr>
+                <w:rFonts w:ascii="Verdana" w:eastAsia="Times New Roman" w:hAnsi="Verdana" w:cs="Times New Roman"/>
+                <w:kern w:val="0"/>
+                <w:sz w:val="20"/>
+                <w:szCs w:val="20"/>
+                <w:lang w:eastAsia="ja-JP"/>
+                <w14:ligatures w14:val="none"/>
+              </w:rPr>
+            </w:pPr>
+            <w:r>
+              <w:rPr>
+                <w:rFonts w:ascii="Verdana" w:eastAsia="Times New Roman" w:hAnsi="Verdana" w:cs="Times New Roman"/>
+                <w:noProof/>
+                <w:kern w:val="0"/>
+                <w:sz w:val="20"/>
+                <w:szCs w:val="20"/>
+                <w:lang w:eastAsia="ja-JP"/>
+                <w14:ligatures w14:val="none"/>
+              </w:rPr>
+              <w:t xml:space="preserve">${/riga_telefono}</w:t>
+            </w:r>
+          </w:p>
+          <w:p>
+            <w:pPr>
+              <w:spacing w:after="0" w:line="240" w:lineRule="auto"/>
+              <w:rPr>
+                <w:rFonts w:ascii="Verdana" w:eastAsia="Times New Roman" w:hAnsi="Verdana" w:cs="Times New Roman"/>
+                <w:kern w:val="0"/>
+                <w:sz w:val="20"/>
+                <w:szCs w:val="20"/>
+                <w:lang w:eastAsia="ja-JP"/>
+                <w14:ligatures w14:val="none"/>
+              </w:rPr>
+            </w:pPr>
+            <w:r>
+              <w:rPr>
+                <w:rFonts w:ascii="Verdana" w:eastAsia="Times New Roman" w:hAnsi="Verdana" w:cs="Times New Roman"/>
+                <w:noProof/>
+                <w:kern w:val="0"/>
+                <w:sz w:val="20"/>
+                <w:szCs w:val="20"/>
+                <w:lang w:eastAsia="ja-JP"/>
+                <w14:ligatures w14:val="none"/>
+              </w:rPr>
+              <w:t xml:space="preserve">${riga_email}</w:t>
+            </w:r>
+          </w:p>
+          <w:p>
+            <w:pPr>
+              <w:spacing w:after="0" w:line="240" w:lineRule="auto"/>
+              <w:rPr>
+                <w:rFonts w:ascii="Verdana" w:eastAsia="Times New Roman" w:hAnsi="Verdana" w:cs="Times New Roman"/>
+                <w:kern w:val="0"/>
+                <w:sz w:val="20"/>
+                <w:szCs w:val="20"/>
+                <w:lang w:eastAsia="ja-JP"/>
+                <w14:ligatures w14:val="none"/>
+              </w:rPr>
+            </w:pPr>
+            <w:r>
+              <w:rPr>
+                <w:rFonts w:ascii="Verdana" w:eastAsia="Times New Roman" w:hAnsi="Verdana" w:cs="Times New Roman"/>
+                <w:noProof/>
+                <w:kern w:val="0"/>
+                <w:sz w:val="20"/>
+                <w:szCs w:val="20"/>
+                <w:lang w:eastAsia="ja-JP"/>
+                <w14:ligatures w14:val="none"/>
+              </w:rPr>
+              <w:t xml:space="preserve">E-mail: ${email}</w:t>
+            </w:r>
+          </w:p>
+          <w:p>
+            <w:pPr>
+              <w:spacing w:after="0" w:line="240" w:lineRule="auto"/>
+              <w:rPr>
+                <w:rFonts w:ascii="Verdana" w:eastAsia="Times New Roman" w:hAnsi="Verdana" w:cs="Times New Roman"/>
+                <w:kern w:val="0"/>
+                <w:sz w:val="20"/>
+                <w:szCs w:val="20"/>
+                <w:lang w:eastAsia="ja-JP"/>
+                <w14:ligatures w14:val="none"/>
+              </w:rPr>
+            </w:pPr>
+            <w:r>
+              <w:rPr>
+                <w:rFonts w:ascii="Verdana" w:eastAsia="Times New Roman" w:hAnsi="Verdana" w:cs="Times New Roman"/>
+                <w:noProof/>
+                <w:kern w:val="0"/>
+                <w:sz w:val="20"/>
+                <w:szCs w:val="20"/>
+                <w:lang w:eastAsia="ja-JP"/>
+                <w14:ligatures w14:val="none"/>
+              </w:rPr>
+              <w:t xml:space="preserve">${/riga_email}</w:t>
+            </w:r>
+          </w:p>
+        </w:tc>
+        <w:tc>
+          <w:tcPr>
+            <w:tcW w:w="4535" w:type="dxa"/>
+          </w:tcPr>
+          <w:p>
+            <w:pPr>
+              <w:spacing w:after="0" w:line="240" w:lineRule="auto"/>
+              <w:rPr>
+                <w:rFonts w:ascii="Verdana" w:eastAsia="Times New Roman" w:hAnsi="Verdana" w:cs="Times New Roman"/>
+                <w:kern w:val="0"/>
+                <w:sz w:val="20"/>
+                <w:szCs w:val="20"/>
+                <w:lang w:eastAsia="ja-JP"/>
+                <w14:ligatures w14:val="none"/>
+              </w:rPr>
+            </w:pPr>
+            <w:bookmarkStart w:id="0" w:name="_Hlk217057176"/>
+            <w:r>
+              <w:rPr>
+                <w:rFonts w:ascii="Verdana" w:eastAsia="Times New Roman" w:hAnsi="Verdana" w:cs="Times New Roman"/>
+                <w:noProof/>
+                <w:kern w:val="0"/>
+                <w:sz w:val="20"/>
+                <w:szCs w:val="20"/>
+                <w:lang w:eastAsia="ja-JP"/>
+                <w14:ligatures w14:val="none"/>
+              </w:rPr>
+              <w:t xml:space="preserve">${titolo}</w:t>
+            </w:r>
+          </w:p>
+          <w:p>
+            <w:pPr>
+              <w:spacing w:after="0" w:line="240" w:lineRule="auto"/>
+              <w:rPr>
+                <w:rFonts w:ascii="Verdana" w:eastAsia="Times New Roman" w:hAnsi="Verdana" w:cs="Times New Roman"/>
+                <w:kern w:val="0"/>
+                <w:sz w:val="20"/>
+                <w:szCs w:val="20"/>
+                <w:lang w:eastAsia="ja-JP"/>
+                <w14:ligatures w14:val="none"/>
+              </w:rPr>
+            </w:pPr>
+            <w:r>
+              <w:rPr>
+                <w:rFonts w:ascii="Verdana" w:eastAsia="Times New Roman" w:hAnsi="Verdana" w:cs="Times New Roman"/>
+                <w:noProof/>
+                <w:kern w:val="0"/>
+                <w:sz w:val="20"/>
+                <w:szCs w:val="20"/>
+                <w:lang w:eastAsia="ja-JP"/>
+                <w14:ligatures w14:val="none"/>
+              </w:rPr>
+              <w:t xml:space="preserve">${destinatario}</w:t>
+            </w:r>
+          </w:p>
+          <w:p>
+            <w:pPr>
+              <w:spacing w:after="0" w:line="240" w:lineRule="auto"/>
+              <w:rPr>
+                <w:rFonts w:ascii="Verdana" w:eastAsia="Times New Roman" w:hAnsi="Verdana" w:cs="Times New Roman"/>
+                <w:kern w:val="0"/>
+                <w:sz w:val="20"/>
+                <w:szCs w:val="20"/>
+                <w:lang w:eastAsia="ja-JP"/>
+                <w14:ligatures w14:val="none"/>
+              </w:rPr>
+            </w:pPr>
+            <w:r>
+              <w:rPr>
+                <w:rFonts w:ascii="Verdana" w:eastAsia="Times New Roman" w:hAnsi="Verdana" w:cs="Times New Roman"/>
+                <w:noProof/>
+                <w:kern w:val="0"/>
+                <w:sz w:val="20"/>
+                <w:szCs w:val="20"/>
+                <w:lang w:eastAsia="ja-JP"/>
+                <w14:ligatures w14:val="none"/>
+              </w:rPr>
+              <w:t xml:space="preserve">${indirizzo}</w:t>
+            </w:r>
+          </w:p>
+          <w:p>
+            <w:pPr>
+              <w:spacing w:after="0" w:line="240" w:lineRule="auto"/>
+              <w:rPr>
+                <w:rFonts w:ascii="Verdana" w:eastAsia="Times New Roman" w:hAnsi="Verdana" w:cs="Times New Roman"/>
+                <w:kern w:val="0"/>
+                <w:sz w:val="20"/>
+                <w:szCs w:val="20"/>
+                <w:lang w:eastAsia="ja-JP"/>
+                <w14:ligatures w14:val="none"/>
+              </w:rPr>
+            </w:pPr>
+            <w:r>
+              <w:rPr>
+                <w:rFonts w:ascii="Verdana" w:eastAsia="Times New Roman" w:hAnsi="Verdana" w:cs="Times New Roman"/>
+                <w:noProof/>
+                <w:kern w:val="0"/>
+                <w:sz w:val="20"/>
+                <w:szCs w:val="20"/>
+                <w:lang w:eastAsia="ja-JP"/>
+                <w14:ligatures w14:val="none"/>
+              </w:rPr>
+              <w:t xml:space="preserve">${cap_citta}</w:t>
+            </w:r>
+          </w:p>
+        </w:tc>
+      </w:tr>
+    </w:tbl>
     <w:p>
       <w:pPr>
         <w:tabs>
           <w:tab w:val="left" w:pos="5103"/>
         </w:tabs>
         <w:spacing w:after="0" w:line="240" w:lineRule="auto"/>
-        <w:ind w:left="5103"/>
-        <w:rPr>
-          <w:rFonts w:ascii="Verdana" w:eastAsia="Times New Roman" w:hAnsi="Verdana" w:cs="Times New Roman"/>
-          <w:kern w:val="0"/>
-          <w:sz w:val="20"/>
-          <w:szCs w:val="20"/>
-          <w:lang w:eastAsia="ja-JP"/>
-          <w14:ligatures w14:val="none"/>
-        </w:rPr>
-      </w:pPr>
-      <w:bookmarkStart w:id="0" w:name="_Hlk217057176"/>
-      <w:r>
-        <w:rPr>
-          <w:rFonts w:ascii="Verdana" w:eastAsia="Times New Roman" w:hAnsi="Verdana" w:cs="Times New Roman"/>
-          <w:noProof/>
-          <w:kern w:val="0"/>
-          <w:sz w:val="20"/>
-          <w:szCs w:val="20"/>
-          <w:lang w:eastAsia="ja-JP"/>
-          <w14:ligatures w14:val="none"/>
-        </w:rPr>
-        <w:t xml:space="preserve">${titolo}</w:t>
-      </w:r>
-    </w:p>
-    <w:p>
-      <w:pPr>
-        <w:tabs>
-          <w:tab w:val="left" w:pos="5103"/>
-        </w:tabs>
-        <w:spacing w:after="0" w:line="240" w:lineRule="auto"/>
-        <w:ind w:left="5103"/>
-        <w:rPr>
-          <w:rFonts w:ascii="Verdana" w:eastAsia="Times New Roman" w:hAnsi="Verdana" w:cs="Times New Roman"/>
-          <w:kern w:val="0"/>
-          <w:sz w:val="20"/>
-          <w:szCs w:val="20"/>
-          <w:lang w:eastAsia="ja-JP"/>
-          <w14:ligatures w14:val="none"/>
-        </w:rPr>
-      </w:pPr>
-      <w:r>
-        <w:rPr>
-          <w:rFonts w:ascii="Verdana" w:eastAsia="Times New Roman" w:hAnsi="Verdana" w:cs="Times New Roman"/>
-          <w:noProof/>
-          <w:kern w:val="0"/>
-          <w:sz w:val="20"/>
-          <w:szCs w:val="20"/>
-          <w:lang w:eastAsia="ja-JP"/>
-          <w14:ligatures w14:val="none"/>
-        </w:rPr>
-        <w:t xml:space="preserve">${destinatario}</w:t>
-      </w:r>
-    </w:p>
-    <w:p>
-      <w:pPr>
-        <w:tabs>
-          <w:tab w:val="left" w:pos="5103"/>
-        </w:tabs>
-        <w:spacing w:after="0" w:line="240" w:lineRule="auto"/>
-        <w:ind w:left="5103"/>
-        <w:rPr>
-          <w:rFonts w:ascii="Verdana" w:eastAsia="Times New Roman" w:hAnsi="Verdana" w:cs="Times New Roman"/>
-          <w:kern w:val="0"/>
-          <w:sz w:val="20"/>
-          <w:szCs w:val="20"/>
-          <w:lang w:eastAsia="ja-JP"/>
-          <w14:ligatures w14:val="none"/>
-        </w:rPr>
-      </w:pPr>
-      <w:r>
-        <w:rPr>
-          <w:rFonts w:ascii="Verdana" w:eastAsia="Times New Roman" w:hAnsi="Verdana" w:cs="Times New Roman"/>
-          <w:noProof/>
-          <w:kern w:val="0"/>
-          <w:sz w:val="20"/>
-          <w:szCs w:val="20"/>
-          <w:lang w:eastAsia="ja-JP"/>
-          <w14:ligatures w14:val="none"/>
-        </w:rPr>
-        <w:t xml:space="preserve">${indirizzo}</w:t>
-      </w:r>
-    </w:p>
-    <w:p>
-      <w:pPr>
-        <w:tabs>
-          <w:tab w:val="left" w:pos="5103"/>
-        </w:tabs>
-        <w:spacing w:after="0" w:line="240" w:lineRule="auto"/>
-        <w:ind w:left="5103"/>
-        <w:rPr>
-          <w:rFonts w:ascii="Verdana" w:eastAsia="Times New Roman" w:hAnsi="Verdana" w:cs="Times New Roman"/>
-          <w:kern w:val="0"/>
-          <w:sz w:val="20"/>
-          <w:szCs w:val="20"/>
-          <w:lang w:eastAsia="ja-JP"/>
-          <w14:ligatures w14:val="none"/>
-        </w:rPr>
-      </w:pPr>
-      <w:r>
-        <w:rPr>
-          <w:rFonts w:ascii="Verdana" w:eastAsia="Times New Roman" w:hAnsi="Verdana" w:cs="Times New Roman"/>
-          <w:noProof/>
-          <w:kern w:val="0"/>
-          <w:sz w:val="20"/>
-          <w:szCs w:val="20"/>
-          <w:lang w:eastAsia="ja-JP"/>
-          <w14:ligatures w14:val="none"/>
-        </w:rPr>
-        <w:t xml:space="preserve">${cap_citta}</w:t>
-      </w:r>
-    </w:p>
-    <w:p>
-      <w:pPr>
-        <w:tabs>
-          <w:tab w:val="left" w:pos="5103"/>
-        </w:tabs>
-        <w:spacing w:after="0" w:line="240" w:lineRule="auto"/>
-        <w:ind w:left="5103"/>
-        <w:rPr>
-          <w:rFonts w:ascii="Verdana" w:eastAsia="Times New Roman" w:hAnsi="Verdana" w:cs="Times New Roman"/>
-          <w:kern w:val="0"/>
-          <w:sz w:val="20"/>
-          <w:szCs w:val="20"/>
-          <w:lang w:eastAsia="ja-JP"/>
-          <w14:ligatures w14:val="none"/>
-        </w:rPr>
-      </w:pPr>
-      <w:r>
-        <w:rPr>
-          <w:rFonts w:ascii="Verdana" w:eastAsia="Times New Roman" w:hAnsi="Verdana" w:cs="Times New Roman"/>
-          <w:noProof/>
-          <w:kern w:val="0"/>
-          <w:sz w:val="20"/>
-          <w:szCs w:val="20"/>
-          <w:lang w:eastAsia="ja-JP"/>
-          <w14:ligatures w14:val="none"/>
-        </w:rPr>
-        <w:t xml:space="preserve">${riga_telefono}</w:t>
-      </w:r>
-    </w:p>
-    <w:p>
-      <w:pPr>
-        <w:tabs>
-          <w:tab w:val="left" w:pos="5103"/>
-        </w:tabs>
-        <w:spacing w:after="0" w:line="240" w:lineRule="auto"/>
-        <w:ind w:left="5103"/>
-        <w:rPr>
-          <w:rFonts w:ascii="Verdana" w:eastAsia="Times New Roman" w:hAnsi="Verdana" w:cs="Times New Roman"/>
-          <w:kern w:val="0"/>
-          <w:sz w:val="20"/>
-          <w:szCs w:val="20"/>
-          <w:lang w:eastAsia="ja-JP"/>
-          <w14:ligatures w14:val="none"/>
-        </w:rPr>
-      </w:pPr>
-      <w:r>
-        <w:rPr>
-          <w:rFonts w:ascii="Verdana" w:eastAsia="Times New Roman" w:hAnsi="Verdana" w:cs="Times New Roman"/>
-          <w:noProof/>
-          <w:kern w:val="0"/>
-          <w:sz w:val="20"/>
-          <w:szCs w:val="20"/>
-          <w:lang w:eastAsia="ja-JP"/>
-          <w14:ligatures w14:val="none"/>
-        </w:rPr>
-        <w:t xml:space="preserve">Tel ${telefono}</w:t>
-      </w:r>
-    </w:p>
-    <w:p>
-      <w:pPr>
-        <w:tabs>
-          <w:tab w:val="left" w:pos="5103"/>
-        </w:tabs>
-        <w:spacing w:after="0" w:line="240" w:lineRule="auto"/>
-        <w:ind w:left="5103"/>
-        <w:rPr>
-          <w:rFonts w:ascii="Verdana" w:eastAsia="Times New Roman" w:hAnsi="Verdana" w:cs="Times New Roman"/>
-          <w:kern w:val="0"/>
-          <w:sz w:val="20"/>
-          <w:szCs w:val="20"/>
-          <w:lang w:eastAsia="ja-JP"/>
-          <w14:ligatures w14:val="none"/>
-        </w:rPr>
-      </w:pPr>
-      <w:r>
-        <w:rPr>
-          <w:rFonts w:ascii="Verdana" w:eastAsia="Times New Roman" w:hAnsi="Verdana" w:cs="Times New Roman"/>
-          <w:noProof/>
-          <w:kern w:val="0"/>
-          <w:sz w:val="20"/>
-          <w:szCs w:val="20"/>
-          <w:lang w:eastAsia="ja-JP"/>
-          <w14:ligatures w14:val="none"/>
-        </w:rPr>
-        <w:t xml:space="preserve">${/riga_telefono}</w:t>
-      </w:r>
-    </w:p>
-    <w:p>
-      <w:pPr>
-        <w:tabs>
-          <w:tab w:val="left" w:pos="5103"/>
-        </w:tabs>
-        <w:spacing w:after="0" w:line="240" w:lineRule="auto"/>
-        <w:ind w:left="5103"/>
-        <w:rPr>
-          <w:rFonts w:ascii="Verdana" w:eastAsia="Times New Roman" w:hAnsi="Verdana" w:cs="Times New Roman"/>
-          <w:kern w:val="0"/>
-          <w:sz w:val="20"/>
-          <w:szCs w:val="20"/>
-          <w:lang w:eastAsia="ja-JP"/>
-          <w14:ligatures w14:val="none"/>
-        </w:rPr>
-      </w:pPr>
-      <w:r>
-        <w:rPr>
-          <w:rFonts w:ascii="Verdana" w:eastAsia="Times New Roman" w:hAnsi="Verdana" w:cs="Times New Roman"/>
-          <w:noProof/>
-          <w:kern w:val="0"/>
-          <w:sz w:val="20"/>
-          <w:szCs w:val="20"/>
-          <w:lang w:eastAsia="ja-JP"/>
-          <w14:ligatures w14:val="none"/>
-        </w:rPr>
-        <w:t xml:space="preserve">${riga_email}</w:t>
-      </w:r>
-    </w:p>
-    <w:p>
-      <w:pPr>
-        <w:tabs>
-          <w:tab w:val="left" w:pos="5103"/>
-        </w:tabs>
-        <w:spacing w:after="0" w:line="240" w:lineRule="auto"/>
-        <w:ind w:left="5103"/>
-        <w:rPr>
-          <w:rFonts w:ascii="Verdana" w:eastAsia="Times New Roman" w:hAnsi="Verdana" w:cs="Times New Roman"/>
-          <w:kern w:val="0"/>
-          <w:sz w:val="20"/>
-          <w:szCs w:val="20"/>
-          <w:lang w:eastAsia="ja-JP"/>
-          <w14:ligatures w14:val="none"/>
-        </w:rPr>
-      </w:pPr>
-      <w:r>
-        <w:rPr>
-          <w:rFonts w:ascii="Verdana" w:eastAsia="Times New Roman" w:hAnsi="Verdana" w:cs="Times New Roman"/>
-          <w:noProof/>
-          <w:kern w:val="0"/>
-          <w:sz w:val="20"/>
-          <w:szCs w:val="20"/>
-          <w:lang w:eastAsia="ja-JP"/>
-          <w14:ligatures w14:val="none"/>
-        </w:rPr>
-        <w:t xml:space="preserve">Posta elettronica: ${email}</w:t>
-      </w:r>
-    </w:p>
-    <w:p>
-      <w:pPr>
-        <w:tabs>
-          <w:tab w:val="left" w:pos="5103"/>
-        </w:tabs>
-        <w:spacing w:after="0" w:line="240" w:lineRule="auto"/>
-        <w:ind w:left="5103"/>
-        <w:rPr>
-          <w:rFonts w:ascii="Verdana" w:eastAsia="Times New Roman" w:hAnsi="Verdana" w:cs="Times New Roman"/>
-          <w:kern w:val="0"/>
-          <w:sz w:val="20"/>
-          <w:szCs w:val="20"/>
-          <w:lang w:eastAsia="ja-JP"/>
-          <w14:ligatures w14:val="none"/>
-        </w:rPr>
-      </w:pPr>
-      <w:r>
-        <w:rPr>
-          <w:rFonts w:ascii="Verdana" w:eastAsia="Times New Roman" w:hAnsi="Verdana" w:cs="Times New Roman"/>
-          <w:noProof/>
-          <w:kern w:val="0"/>
-          <w:sz w:val="20"/>
-          <w:szCs w:val="20"/>
-          <w:lang w:eastAsia="ja-JP"/>
-          <w14:ligatures w14:val="none"/>
-        </w:rPr>
-        <w:t xml:space="preserve">${/riga_email}</w:t>
-      </w:r>
-    </w:p>
-    <w:p>
-      <w:pPr>
-        <w:tabs>
-          <w:tab w:val="left" w:pos="5103"/>
-        </w:tabs>
-        <w:spacing w:after="0" w:line="240" w:lineRule="auto"/>
         <w:rPr>
           <w:rFonts w:ascii="Verdana" w:eastAsia="Times New Roman" w:hAnsi="Verdana" w:cs="Times New Roman"/>
           <w:kern w:val="0"/>
@@ -555,6 +556,10 @@
     </w:p>
     <w:p>
       <w:pPr>
+        <w:numPr>
+          <w:ilvl w:val="0"/>
+          <w:numId w:val="8"/>
+        </w:numPr>
         <w:spacing w:after="0" w:line="240" w:lineRule="auto"/>
         <w:jc w:val="both"/>
         <w:rPr>
@@ -576,7 +581,7 @@
           <w:lang w:eastAsia="ja-JP"/>
           <w14:ligatures w14:val="none"/>
         </w:rPr>
-        <w:t xml:space="preserve">- ${apparecchiatura}</w:t>
+        <w:t>${apparecchiatura}</w:t>
       </w:r>
     </w:p>
     <w:p>
@@ -703,6 +708,10 @@
     </w:p>
     <w:p>
       <w:pPr>
+        <w:numPr>
+          <w:ilvl w:val="0"/>
+          <w:numId w:val="8"/>
+        </w:numPr>
         <w:spacing w:after="0" w:line="240" w:lineRule="auto"/>
         <w:jc w:val="both"/>
         <w:rPr>
@@ -724,7 +733,7 @@
           <w:lang w:eastAsia="ja-JP"/>
           <w14:ligatures w14:val="none"/>
         </w:rPr>
-        <w:t xml:space="preserve">- ${operazione}</w:t>
+        <w:t>${operazione}</w:t>
       </w:r>
     </w:p>
     <w:p>
@@ -1268,302 +1277,303 @@
         </w:rPr>
       </w:pPr>
     </w:p>
+    <w:tbl>
+      <w:tblPr>
+        <w:tblW w:w="9638" w:type="dxa"/>
+        <w:tblLayout w:type="fixed"/>
+        <w:tblCellMar>
+          <w:left w:w="0" w:type="dxa"/>
+          <w:right w:w="0" w:type="dxa"/>
+        </w:tblCellMar>
+        <w:tblLook w:val="0000" w:firstRow="0" w:lastRow="0" w:firstColumn="0" w:lastColumn="0" w:noHBand="0" w:noVBand="0"/>
+      </w:tblPr>
+      <w:tblGrid>
+        <w:gridCol w:w="5103"/>
+        <w:gridCol w:w="4535"/>
+      </w:tblGrid>
+      <w:tr>
+        <w:tc>
+          <w:tcPr>
+            <w:tcW w:w="5103" w:type="dxa"/>
+            <w:vAlign w:val="bottom"/>
+          </w:tcPr>
+          <w:p>
+            <w:pPr>
+              <w:spacing w:after="0" w:line="240" w:lineRule="auto"/>
+              <w:rPr>
+                <w:rFonts w:ascii="Verdana" w:eastAsia="Times New Roman" w:hAnsi="Verdana" w:cs="Times New Roman"/>
+                <w:kern w:val="0"/>
+                <w:sz w:val="20"/>
+                <w:szCs w:val="20"/>
+                <w:lang w:eastAsia="ja-JP"/>
+                <w14:ligatures w14:val="none"/>
+              </w:rPr>
+            </w:pPr>
+          </w:p>
+          <w:p>
+            <w:pPr>
+              <w:spacing w:after="0" w:line="240" w:lineRule="auto"/>
+              <w:rPr>
+                <w:rFonts w:ascii="Verdana" w:eastAsia="Times New Roman" w:hAnsi="Verdana" w:cs="Times New Roman"/>
+                <w:kern w:val="0"/>
+                <w:sz w:val="20"/>
+                <w:szCs w:val="20"/>
+                <w:lang w:eastAsia="ja-JP"/>
+                <w14:ligatures w14:val="none"/>
+              </w:rPr>
+            </w:pPr>
+            <w:r>
+              <w:rPr>
+                <w:rFonts w:ascii="Verdana" w:eastAsia="Times New Roman" w:hAnsi="Verdana" w:cs="Times New Roman"/>
+                <w:noProof/>
+                <w:kern w:val="0"/>
+                <w:sz w:val="20"/>
+                <w:szCs w:val="20"/>
+                <w:lang w:eastAsia="ja-JP"/>
+                <w14:ligatures w14:val="none"/>
+              </w:rPr>
+              <w:t xml:space="preserve">${riga_telefono}</w:t>
+            </w:r>
+          </w:p>
+          <w:p>
+            <w:pPr>
+              <w:spacing w:after="0" w:line="240" w:lineRule="auto"/>
+              <w:rPr>
+                <w:rFonts w:ascii="Verdana" w:eastAsia="Times New Roman" w:hAnsi="Verdana" w:cs="Times New Roman"/>
+                <w:kern w:val="0"/>
+                <w:sz w:val="20"/>
+                <w:szCs w:val="20"/>
+                <w:lang w:eastAsia="ja-JP"/>
+                <w14:ligatures w14:val="none"/>
+              </w:rPr>
+            </w:pPr>
+            <w:r>
+              <w:rPr>
+                <w:rFonts w:ascii="Verdana" w:eastAsia="Times New Roman" w:hAnsi="Verdana" w:cs="Times New Roman"/>
+                <w:noProof/>
+                <w:kern w:val="0"/>
+                <w:sz w:val="20"/>
+                <w:szCs w:val="20"/>
+                <w:lang w:eastAsia="ja-JP"/>
+                <w14:ligatures w14:val="none"/>
+              </w:rPr>
+              <w:t xml:space="preserve">Tel ${telefono}</w:t>
+            </w:r>
+          </w:p>
+          <w:p>
+            <w:pPr>
+              <w:spacing w:after="0" w:line="240" w:lineRule="auto"/>
+              <w:rPr>
+                <w:rFonts w:ascii="Verdana" w:eastAsia="Times New Roman" w:hAnsi="Verdana" w:cs="Times New Roman"/>
+                <w:kern w:val="0"/>
+                <w:sz w:val="20"/>
+                <w:szCs w:val="20"/>
+                <w:lang w:eastAsia="ja-JP"/>
+                <w14:ligatures w14:val="none"/>
+              </w:rPr>
+            </w:pPr>
+            <w:r>
+              <w:rPr>
+                <w:rFonts w:ascii="Verdana" w:eastAsia="Times New Roman" w:hAnsi="Verdana" w:cs="Times New Roman"/>
+                <w:noProof/>
+                <w:kern w:val="0"/>
+                <w:sz w:val="20"/>
+                <w:szCs w:val="20"/>
+                <w:lang w:eastAsia="ja-JP"/>
+                <w14:ligatures w14:val="none"/>
+              </w:rPr>
+              <w:t xml:space="preserve">${/riga_telefono}</w:t>
+            </w:r>
+          </w:p>
+          <w:p>
+            <w:pPr>
+              <w:spacing w:after="0" w:line="240" w:lineRule="auto"/>
+              <w:rPr>
+                <w:rFonts w:ascii="Verdana" w:eastAsia="Times New Roman" w:hAnsi="Verdana" w:cs="Times New Roman"/>
+                <w:kern w:val="0"/>
+                <w:sz w:val="20"/>
+                <w:szCs w:val="20"/>
+                <w:lang w:eastAsia="ja-JP"/>
+                <w14:ligatures w14:val="none"/>
+              </w:rPr>
+            </w:pPr>
+            <w:r>
+              <w:rPr>
+                <w:rFonts w:ascii="Verdana" w:eastAsia="Times New Roman" w:hAnsi="Verdana" w:cs="Times New Roman"/>
+                <w:noProof/>
+                <w:kern w:val="0"/>
+                <w:sz w:val="20"/>
+                <w:szCs w:val="20"/>
+                <w:lang w:eastAsia="ja-JP"/>
+                <w14:ligatures w14:val="none"/>
+              </w:rPr>
+              <w:t xml:space="preserve">${riga_email}</w:t>
+            </w:r>
+          </w:p>
+          <w:p>
+            <w:pPr>
+              <w:spacing w:after="0" w:line="240" w:lineRule="auto"/>
+              <w:rPr>
+                <w:rFonts w:ascii="Verdana" w:eastAsia="Times New Roman" w:hAnsi="Verdana" w:cs="Times New Roman"/>
+                <w:kern w:val="0"/>
+                <w:sz w:val="20"/>
+                <w:szCs w:val="20"/>
+                <w:lang w:eastAsia="ja-JP"/>
+                <w14:ligatures w14:val="none"/>
+              </w:rPr>
+            </w:pPr>
+            <w:r>
+              <w:rPr>
+                <w:rFonts w:ascii="Verdana" w:eastAsia="Times New Roman" w:hAnsi="Verdana" w:cs="Times New Roman"/>
+                <w:noProof/>
+                <w:kern w:val="0"/>
+                <w:sz w:val="20"/>
+                <w:szCs w:val="20"/>
+                <w:lang w:eastAsia="ja-JP"/>
+                <w14:ligatures w14:val="none"/>
+              </w:rPr>
+              <w:t xml:space="preserve">E-mail: ${email}</w:t>
+            </w:r>
+          </w:p>
+          <w:p>
+            <w:pPr>
+              <w:spacing w:after="0" w:line="240" w:lineRule="auto"/>
+              <w:rPr>
+                <w:rFonts w:ascii="Verdana" w:eastAsia="Times New Roman" w:hAnsi="Verdana" w:cs="Times New Roman"/>
+                <w:kern w:val="0"/>
+                <w:sz w:val="20"/>
+                <w:szCs w:val="20"/>
+                <w:lang w:eastAsia="ja-JP"/>
+                <w14:ligatures w14:val="none"/>
+              </w:rPr>
+            </w:pPr>
+            <w:r>
+              <w:rPr>
+                <w:rFonts w:ascii="Verdana" w:eastAsia="Times New Roman" w:hAnsi="Verdana" w:cs="Times New Roman"/>
+                <w:noProof/>
+                <w:kern w:val="0"/>
+                <w:sz w:val="20"/>
+                <w:szCs w:val="20"/>
+                <w:lang w:eastAsia="ja-JP"/>
+                <w14:ligatures w14:val="none"/>
+              </w:rPr>
+              <w:t xml:space="preserve">${/riga_email}</w:t>
+            </w:r>
+          </w:p>
+        </w:tc>
+        <w:tc>
+          <w:tcPr>
+            <w:tcW w:w="4535" w:type="dxa"/>
+          </w:tcPr>
+          <w:p>
+            <w:pPr>
+              <w:spacing w:after="0" w:line="240" w:lineRule="auto"/>
+              <w:rPr>
+                <w:rFonts w:ascii="Verdana" w:eastAsia="Times New Roman" w:hAnsi="Verdana" w:cs="Times New Roman"/>
+                <w:kern w:val="0"/>
+                <w:sz w:val="20"/>
+                <w:szCs w:val="20"/>
+                <w:lang w:eastAsia="ja-JP"/>
+                <w14:ligatures w14:val="none"/>
+              </w:rPr>
+            </w:pPr>
+            <w:r>
+              <w:rPr>
+                <w:rFonts w:ascii="Verdana" w:eastAsia="Times New Roman" w:hAnsi="Verdana" w:cs="Times New Roman"/>
+                <w:noProof/>
+                <w:kern w:val="0"/>
+                <w:sz w:val="20"/>
+                <w:szCs w:val="20"/>
+                <w:lang w:eastAsia="ja-JP"/>
+                <w14:ligatures w14:val="none"/>
+              </w:rPr>
+              <w:t xml:space="preserve">${titolo}</w:t>
+            </w:r>
+          </w:p>
+          <w:p>
+            <w:pPr>
+              <w:spacing w:after="0" w:line="240" w:lineRule="auto"/>
+              <w:rPr>
+                <w:rFonts w:ascii="Verdana" w:eastAsia="Times New Roman" w:hAnsi="Verdana" w:cs="Times New Roman"/>
+                <w:kern w:val="0"/>
+                <w:sz w:val="20"/>
+                <w:szCs w:val="20"/>
+                <w:lang w:eastAsia="ja-JP"/>
+                <w14:ligatures w14:val="none"/>
+              </w:rPr>
+            </w:pPr>
+            <w:r>
+              <w:rPr>
+                <w:rFonts w:ascii="Verdana" w:eastAsia="Times New Roman" w:hAnsi="Verdana" w:cs="Times New Roman"/>
+                <w:noProof/>
+                <w:kern w:val="0"/>
+                <w:sz w:val="20"/>
+                <w:szCs w:val="20"/>
+                <w:lang w:eastAsia="ja-JP"/>
+                <w14:ligatures w14:val="none"/>
+              </w:rPr>
+              <w:t xml:space="preserve">${destinatario}</w:t>
+            </w:r>
+          </w:p>
+          <w:p>
+            <w:pPr>
+              <w:spacing w:after="0" w:line="240" w:lineRule="auto"/>
+              <w:rPr>
+                <w:rFonts w:ascii="Verdana" w:eastAsia="Times New Roman" w:hAnsi="Verdana" w:cs="Times New Roman"/>
+                <w:kern w:val="0"/>
+                <w:sz w:val="20"/>
+                <w:szCs w:val="20"/>
+                <w:lang w:eastAsia="ja-JP"/>
+                <w14:ligatures w14:val="none"/>
+              </w:rPr>
+            </w:pPr>
+            <w:r>
+              <w:rPr>
+                <w:rFonts w:ascii="Verdana" w:eastAsia="Times New Roman" w:hAnsi="Verdana" w:cs="Times New Roman"/>
+                <w:noProof/>
+                <w:kern w:val="0"/>
+                <w:sz w:val="20"/>
+                <w:szCs w:val="20"/>
+                <w:lang w:eastAsia="ja-JP"/>
+                <w14:ligatures w14:val="none"/>
+              </w:rPr>
+              <w:t xml:space="preserve">${indirizzo}</w:t>
+            </w:r>
+          </w:p>
+          <w:p>
+            <w:pPr>
+              <w:spacing w:after="0" w:line="240" w:lineRule="auto"/>
+              <w:rPr>
+                <w:rFonts w:ascii="Verdana" w:eastAsia="Times New Roman" w:hAnsi="Verdana" w:cs="Times New Roman"/>
+                <w:kern w:val="0"/>
+                <w:sz w:val="20"/>
+                <w:szCs w:val="20"/>
+                <w:lang w:eastAsia="ja-JP"/>
+                <w14:ligatures w14:val="none"/>
+              </w:rPr>
+            </w:pPr>
+            <w:r>
+              <w:rPr>
+                <w:rFonts w:ascii="Verdana" w:eastAsia="Times New Roman" w:hAnsi="Verdana" w:cs="Times New Roman"/>
+                <w:noProof/>
+                <w:kern w:val="0"/>
+                <w:sz w:val="20"/>
+                <w:szCs w:val="20"/>
+                <w:lang w:eastAsia="ja-JP"/>
+                <w14:ligatures w14:val="none"/>
+              </w:rPr>
+              <w:t xml:space="preserve">${cap_citta}</w:t>
+            </w:r>
+          </w:p>
+        </w:tc>
+      </w:tr>
+    </w:tbl>
     <w:p>
       <w:pPr>
         <w:tabs>
           <w:tab w:val="left" w:pos="5103"/>
         </w:tabs>
         <w:spacing w:after="0" w:line="240" w:lineRule="auto"/>
-        <w:ind w:left="5103"/>
-        <w:rPr>
-          <w:rFonts w:ascii="Verdana" w:eastAsia="Times New Roman" w:hAnsi="Verdana" w:cs="Times New Roman"/>
-          <w:kern w:val="0"/>
-          <w:sz w:val="20"/>
-          <w:szCs w:val="20"/>
-          <w:lang w:eastAsia="ja-JP"/>
-          <w14:ligatures w14:val="none"/>
-        </w:rPr>
-      </w:pPr>
-      <w:r>
-        <w:rPr>
-          <w:rFonts w:ascii="Verdana" w:eastAsia="Times New Roman" w:hAnsi="Verdana" w:cs="Times New Roman"/>
-          <w:noProof/>
-          <w:kern w:val="0"/>
-          <w:sz w:val="20"/>
-          <w:szCs w:val="20"/>
-          <w:lang w:eastAsia="ja-JP"/>
-          <w14:ligatures w14:val="none"/>
-        </w:rPr>
-        <w:t xml:space="preserve">${titolo}</w:t>
-      </w:r>
-    </w:p>
-    <w:p>
-      <w:pPr>
-        <w:tabs>
-          <w:tab w:val="left" w:pos="5103"/>
-        </w:tabs>
-        <w:spacing w:after="0" w:line="240" w:lineRule="auto"/>
-        <w:ind w:left="5103"/>
-        <w:rPr>
-          <w:rFonts w:ascii="Verdana" w:eastAsia="Times New Roman" w:hAnsi="Verdana" w:cs="Times New Roman"/>
-          <w:kern w:val="0"/>
-          <w:sz w:val="20"/>
-          <w:szCs w:val="20"/>
-          <w:lang w:eastAsia="ja-JP"/>
-          <w14:ligatures w14:val="none"/>
-        </w:rPr>
-      </w:pPr>
-      <w:r>
-        <w:rPr>
-          <w:rFonts w:ascii="Verdana" w:eastAsia="Times New Roman" w:hAnsi="Verdana" w:cs="Times New Roman"/>
-          <w:noProof/>
-          <w:kern w:val="0"/>
-          <w:sz w:val="20"/>
-          <w:szCs w:val="20"/>
-          <w:lang w:eastAsia="ja-JP"/>
-          <w14:ligatures w14:val="none"/>
-        </w:rPr>
-        <w:t xml:space="preserve">${destinatario}</w:t>
-      </w:r>
-    </w:p>
-    <w:p>
-      <w:pPr>
-        <w:tabs>
-          <w:tab w:val="left" w:pos="5103"/>
-        </w:tabs>
-        <w:spacing w:after="0" w:line="240" w:lineRule="auto"/>
-        <w:ind w:left="5103"/>
-        <w:rPr>
-          <w:rFonts w:ascii="Verdana" w:eastAsia="Times New Roman" w:hAnsi="Verdana" w:cs="Times New Roman"/>
-          <w:kern w:val="0"/>
-          <w:sz w:val="20"/>
-          <w:szCs w:val="20"/>
-          <w:lang w:eastAsia="ja-JP"/>
-          <w14:ligatures w14:val="none"/>
-        </w:rPr>
-      </w:pPr>
-      <w:r>
-        <w:rPr>
-          <w:rFonts w:ascii="Verdana" w:eastAsia="Times New Roman" w:hAnsi="Verdana" w:cs="Times New Roman"/>
-          <w:noProof/>
-          <w:kern w:val="0"/>
-          <w:sz w:val="20"/>
-          <w:szCs w:val="20"/>
-          <w:lang w:eastAsia="ja-JP"/>
-          <w14:ligatures w14:val="none"/>
-        </w:rPr>
-        <w:t xml:space="preserve">${indirizzo}</w:t>
-      </w:r>
-    </w:p>
-    <w:p>
-      <w:pPr>
-        <w:tabs>
-          <w:tab w:val="left" w:pos="5103"/>
-        </w:tabs>
-        <w:spacing w:after="0" w:line="240" w:lineRule="auto"/>
-        <w:ind w:left="5103"/>
-        <w:rPr>
-          <w:rFonts w:ascii="Verdana" w:eastAsia="Times New Roman" w:hAnsi="Verdana" w:cs="Times New Roman"/>
-          <w:kern w:val="0"/>
-          <w:sz w:val="20"/>
-          <w:szCs w:val="20"/>
-          <w:lang w:eastAsia="ja-JP"/>
-          <w14:ligatures w14:val="none"/>
-        </w:rPr>
-      </w:pPr>
-      <w:r>
-        <w:rPr>
-          <w:rFonts w:ascii="Verdana" w:eastAsia="Times New Roman" w:hAnsi="Verdana" w:cs="Times New Roman"/>
-          <w:noProof/>
-          <w:kern w:val="0"/>
-          <w:sz w:val="20"/>
-          <w:szCs w:val="20"/>
-          <w:lang w:eastAsia="ja-JP"/>
-          <w14:ligatures w14:val="none"/>
-        </w:rPr>
-        <w:t xml:space="preserve">${cap_citta}</w:t>
-      </w:r>
-    </w:p>
-    <w:p>
-      <w:pPr>
-        <w:tabs>
-          <w:tab w:val="left" w:pos="5103"/>
-        </w:tabs>
-        <w:spacing w:after="0" w:line="240" w:lineRule="auto"/>
-        <w:ind w:left="5103"/>
-        <w:rPr>
-          <w:rFonts w:ascii="Verdana" w:eastAsia="Times New Roman" w:hAnsi="Verdana" w:cs="Times New Roman"/>
-          <w:kern w:val="0"/>
-          <w:sz w:val="20"/>
-          <w:szCs w:val="20"/>
-          <w:lang w:eastAsia="ja-JP"/>
-          <w14:ligatures w14:val="none"/>
-        </w:rPr>
-      </w:pPr>
-      <w:r>
-        <w:rPr>
-          <w:rFonts w:ascii="Verdana" w:eastAsia="Times New Roman" w:hAnsi="Verdana" w:cs="Times New Roman"/>
-          <w:noProof/>
-          <w:kern w:val="0"/>
-          <w:sz w:val="20"/>
-          <w:szCs w:val="20"/>
-          <w:lang w:eastAsia="ja-JP"/>
-          <w14:ligatures w14:val="none"/>
-        </w:rPr>
-        <w:t xml:space="preserve">${riga_telefono}</w:t>
-      </w:r>
-    </w:p>
-    <w:p>
-      <w:pPr>
-        <w:tabs>
-          <w:tab w:val="left" w:pos="5103"/>
-        </w:tabs>
-        <w:spacing w:after="0" w:line="240" w:lineRule="auto"/>
-        <w:ind w:left="5103"/>
-        <w:rPr>
-          <w:rFonts w:ascii="Verdana" w:eastAsia="Times New Roman" w:hAnsi="Verdana" w:cs="Times New Roman"/>
-          <w:kern w:val="0"/>
-          <w:sz w:val="20"/>
-          <w:szCs w:val="20"/>
-          <w:lang w:eastAsia="ja-JP"/>
-          <w14:ligatures w14:val="none"/>
-        </w:rPr>
-      </w:pPr>
-      <w:r>
-        <w:rPr>
-          <w:rFonts w:ascii="Verdana" w:eastAsia="Times New Roman" w:hAnsi="Verdana" w:cs="Times New Roman"/>
-          <w:noProof/>
-          <w:kern w:val="0"/>
-          <w:sz w:val="20"/>
-          <w:szCs w:val="20"/>
-          <w:lang w:eastAsia="ja-JP"/>
-          <w14:ligatures w14:val="none"/>
-        </w:rPr>
-        <w:t xml:space="preserve">Tel ${telefono}</w:t>
-      </w:r>
-    </w:p>
-    <w:p>
-      <w:pPr>
-        <w:tabs>
-          <w:tab w:val="left" w:pos="5103"/>
-        </w:tabs>
-        <w:spacing w:after="0" w:line="240" w:lineRule="auto"/>
-        <w:ind w:left="5103"/>
-        <w:rPr>
-          <w:rFonts w:ascii="Verdana" w:eastAsia="Times New Roman" w:hAnsi="Verdana" w:cs="Times New Roman"/>
-          <w:kern w:val="0"/>
-          <w:sz w:val="20"/>
-          <w:szCs w:val="20"/>
-          <w:lang w:eastAsia="ja-JP"/>
-          <w14:ligatures w14:val="none"/>
-        </w:rPr>
-      </w:pPr>
-      <w:r>
-        <w:rPr>
-          <w:rFonts w:ascii="Verdana" w:eastAsia="Times New Roman" w:hAnsi="Verdana" w:cs="Times New Roman"/>
-          <w:noProof/>
-          <w:kern w:val="0"/>
-          <w:sz w:val="20"/>
-          <w:szCs w:val="20"/>
-          <w:lang w:eastAsia="ja-JP"/>
-          <w14:ligatures w14:val="none"/>
-        </w:rPr>
-        <w:t xml:space="preserve">${/riga_telefono}</w:t>
-      </w:r>
-    </w:p>
-    <w:p>
-      <w:pPr>
-        <w:tabs>
-          <w:tab w:val="left" w:pos="5103"/>
-        </w:tabs>
-        <w:spacing w:after="0" w:line="240" w:lineRule="auto"/>
-        <w:ind w:left="5103"/>
-        <w:rPr>
-          <w:rFonts w:ascii="Verdana" w:eastAsia="Times New Roman" w:hAnsi="Verdana" w:cs="Times New Roman"/>
-          <w:kern w:val="0"/>
-          <w:sz w:val="20"/>
-          <w:szCs w:val="20"/>
-          <w:lang w:eastAsia="ja-JP"/>
-          <w14:ligatures w14:val="none"/>
-        </w:rPr>
-      </w:pPr>
-      <w:r>
-        <w:rPr>
-          <w:rFonts w:ascii="Verdana" w:eastAsia="Times New Roman" w:hAnsi="Verdana" w:cs="Times New Roman"/>
-          <w:noProof/>
-          <w:kern w:val="0"/>
-          <w:sz w:val="20"/>
-          <w:szCs w:val="20"/>
-          <w:lang w:eastAsia="ja-JP"/>
-          <w14:ligatures w14:val="none"/>
-        </w:rPr>
-        <w:t xml:space="preserve">${riga_email}</w:t>
-      </w:r>
-    </w:p>
-    <w:p>
-      <w:pPr>
-        <w:tabs>
-          <w:tab w:val="left" w:pos="5103"/>
-        </w:tabs>
-        <w:spacing w:after="0" w:line="240" w:lineRule="auto"/>
-        <w:ind w:left="5103"/>
-        <w:rPr>
-          <w:rFonts w:ascii="Verdana" w:eastAsia="Times New Roman" w:hAnsi="Verdana" w:cs="Times New Roman"/>
-          <w:kern w:val="0"/>
-          <w:sz w:val="20"/>
-          <w:szCs w:val="20"/>
-          <w:lang w:eastAsia="ja-JP"/>
-          <w14:ligatures w14:val="none"/>
-        </w:rPr>
-      </w:pPr>
-      <w:r>
-        <w:rPr>
-          <w:rFonts w:ascii="Verdana" w:eastAsia="Times New Roman" w:hAnsi="Verdana" w:cs="Times New Roman"/>
-          <w:noProof/>
-          <w:kern w:val="0"/>
-          <w:sz w:val="20"/>
-          <w:szCs w:val="20"/>
-          <w:lang w:eastAsia="ja-JP"/>
-          <w14:ligatures w14:val="none"/>
-        </w:rPr>
-        <w:t xml:space="preserve">Posta elettronica: ${email}</w:t>
-      </w:r>
-    </w:p>
-    <w:p>
-      <w:pPr>
-        <w:tabs>
-          <w:tab w:val="left" w:pos="5103"/>
-        </w:tabs>
-        <w:spacing w:after="0" w:line="240" w:lineRule="auto"/>
-        <w:ind w:left="5103"/>
-        <w:rPr>
-          <w:rFonts w:ascii="Verdana" w:eastAsia="Times New Roman" w:hAnsi="Verdana" w:cs="Times New Roman"/>
-          <w:kern w:val="0"/>
-          <w:sz w:val="20"/>
-          <w:szCs w:val="20"/>
-          <w:lang w:eastAsia="ja-JP"/>
-          <w14:ligatures w14:val="none"/>
-        </w:rPr>
-      </w:pPr>
-      <w:r>
-        <w:rPr>
-          <w:rFonts w:ascii="Verdana" w:eastAsia="Times New Roman" w:hAnsi="Verdana" w:cs="Times New Roman"/>
-          <w:noProof/>
-          <w:kern w:val="0"/>
-          <w:sz w:val="20"/>
-          <w:szCs w:val="20"/>
-          <w:lang w:eastAsia="ja-JP"/>
-          <w14:ligatures w14:val="none"/>
-        </w:rPr>
-        <w:t xml:space="preserve">${/riga_email}</w:t>
-      </w:r>
-    </w:p>
-    <w:p>
-      <w:pPr>
-        <w:tabs>
-          <w:tab w:val="left" w:pos="5103"/>
-        </w:tabs>
-        <w:spacing w:after="0" w:line="240" w:lineRule="auto"/>
         <w:rPr>
           <w:rFonts w:ascii="Verdana" w:eastAsia="Times New Roman" w:hAnsi="Verdana" w:cs="Times New Roman"/>
           <w:kern w:val="0"/>
@@ -1802,6 +1812,10 @@
     </w:p>
     <w:p>
       <w:pPr>
+        <w:numPr>
+          <w:ilvl w:val="0"/>
+          <w:numId w:val="8"/>
+        </w:numPr>
         <w:spacing w:after="0" w:line="240" w:lineRule="auto"/>
         <w:jc w:val="both"/>
         <w:rPr>
@@ -1823,7 +1837,7 @@
           <w:lang w:eastAsia="ja-JP"/>
           <w14:ligatures w14:val="none"/>
         </w:rPr>
-        <w:t xml:space="preserve">- ${apparecchiatura}</w:t>
+        <w:t>${apparecchiatura}</w:t>
       </w:r>
     </w:p>
     <w:p>
@@ -1950,6 +1964,10 @@
     </w:p>
     <w:p>
       <w:pPr>
+        <w:numPr>
+          <w:ilvl w:val="0"/>
+          <w:numId w:val="8"/>
+        </w:numPr>
         <w:spacing w:after="0" w:line="240" w:lineRule="auto"/>
         <w:jc w:val="both"/>
         <w:rPr>
@@ -1971,7 +1989,7 @@
           <w:lang w:eastAsia="ja-JP"/>
           <w14:ligatures w14:val="none"/>
         </w:rPr>
-        <w:t xml:space="preserve">- ${operazione}</w:t>
+        <w:t>${operazione}</w:t>
       </w:r>
     </w:p>
     <w:p>
@@ -3106,12 +3124,12 @@
         <wp:anchor distT="0" distB="0" distL="114300" distR="114300" simplePos="0" relativeHeight="251659264" behindDoc="1" locked="0" layoutInCell="1" allowOverlap="1" wp14:anchorId="309B284F" wp14:editId="116DC4D6">
           <wp:simplePos x="0" y="0"/>
           <wp:positionH relativeFrom="column">
-            <wp:posOffset>1156335</wp:posOffset>
+            <wp:posOffset>1130460</wp:posOffset>
           </wp:positionH>
           <wp:positionV relativeFrom="paragraph">
-            <wp:posOffset>-171754</wp:posOffset>
+            <wp:posOffset>-248429</wp:posOffset>
           </wp:positionV>
-          <wp:extent cx="3872230" cy="768985"/>
+          <wp:extent cx="3922687" cy="821539"/>
           <wp:effectExtent l="0" t="0" r="0" b="0"/>
           <wp:wrapNone/>
           <wp:docPr id="850985074" name="Immagine 1" descr="Immagine che contiene Elementi grafici, grafica, arte, design&#10;&#10;Il contenuto generato dall'IA potrebbe non essere corretto."/>
@@ -3140,7 +3158,7 @@
                 <pic:spPr>
                   <a:xfrm>
                     <a:off x="0" y="0"/>
-                    <a:ext cx="3872230" cy="768985"/>
+                    <a:ext cx="3922687" cy="821539"/>
                   </a:xfrm>
                   <a:prstGeom prst="rect">
                     <a:avLst/>
@@ -3296,6 +3314,7 @@
   <w:p>
     <w:pPr>
       <w:pStyle w:val="Intestazione"/>
+      <w:spacing w:before="120"/>
       <w:jc w:val="center"/>
       <w:rPr>
         <w:color w:val="FF0000"/>
@@ -3351,12 +3370,12 @@
         <wp:anchor distT="0" distB="0" distL="114300" distR="114300" simplePos="0" relativeHeight="251664384" behindDoc="1" locked="0" layoutInCell="1" allowOverlap="1" wp14:anchorId="086D097B" wp14:editId="5A117758">
           <wp:simplePos x="0" y="0"/>
           <wp:positionH relativeFrom="column">
-            <wp:posOffset>1155948</wp:posOffset>
+            <wp:posOffset>1130073</wp:posOffset>
           </wp:positionH>
           <wp:positionV relativeFrom="paragraph">
-            <wp:posOffset>-187187</wp:posOffset>
+            <wp:posOffset>-263862</wp:posOffset>
           </wp:positionV>
-          <wp:extent cx="3872230" cy="768985"/>
+          <wp:extent cx="3922687" cy="821539"/>
           <wp:effectExtent l="0" t="0" r="0" b="0"/>
           <wp:wrapTight wrapText="bothSides">
             <wp:wrapPolygon edited="0">
@@ -3402,7 +3421,7 @@
                 <pic:spPr>
                   <a:xfrm>
                     <a:off x="0" y="0"/>
-                    <a:ext cx="3872230" cy="768985"/>
+                    <a:ext cx="3922687" cy="821539"/>
                   </a:xfrm>
                   <a:prstGeom prst="rect">
                     <a:avLst/>
@@ -3577,6 +3596,7 @@
   <w:p>
     <w:pPr>
       <w:pStyle w:val="Intestazione"/>
+      <w:spacing w:before="120"/>
       <w:jc w:val="center"/>
       <w:rPr>
         <w:color w:val="00B0F0"/>

</xml_diff>

<commit_message>
v0.41.1 — La durata nella proposta degli impianti
Co-Authored-By: Claude Opus 5.5 <noreply@anthropic.com>
</commit_message>
<xml_diff>
--- a/app/Templates/word/proposta_addolcitori.docx
+++ b/app/Templates/word/proposta_addolcitori.docx
@@ -844,7 +844,7 @@
           <w:lang w:eastAsia="ja-JP"/>
           <w14:ligatures w14:val="none"/>
         </w:rPr>
-        <w:t xml:space="preserve">UN ANNO dal ${data_inizio} al ${data_fine}</w:t>
+        <w:t xml:space="preserve">Dal ${data_inizio} al ${data_fine}</w:t>
       </w:r>
     </w:p>
     <w:p>
@@ -2100,7 +2100,7 @@
           <w:lang w:eastAsia="ja-JP"/>
           <w14:ligatures w14:val="none"/>
         </w:rPr>
-        <w:t xml:space="preserve">UN ANNO dal ${data_inizio} al ${data_fine}</w:t>
+        <w:t xml:space="preserve">Dal ${data_inizio} al ${data_fine}</w:t>
       </w:r>
     </w:p>
     <w:p>

</xml_diff>